<commit_message>
Version 3 of SRS Document (Jira Board and SCRUM)
Created Jira Board and Implemented SCRUM Sprints.
</commit_message>
<xml_diff>
--- a/AI Usage Document.docx
+++ b/AI Usage Document.docx
@@ -69,7 +69,23 @@
           <w:sz w:val="22"/>
           <w:szCs w:val="22"/>
         </w:rPr>
-        <w:t xml:space="preserve"> AI to figure what would be the best structure for creating a Work Breakdown Structure for this project.</w:t>
+        <w:t xml:space="preserve"> AI to figure </w:t>
+      </w:r>
+      <w:r>
+        <w:rPr>
+          <w:rFonts w:ascii="Times New Roman" w:hAnsi="Times New Roman" w:cs="Times New Roman"/>
+          <w:sz w:val="22"/>
+          <w:szCs w:val="22"/>
+        </w:rPr>
+        <w:t xml:space="preserve">out </w:t>
+      </w:r>
+      <w:r>
+        <w:rPr>
+          <w:rFonts w:ascii="Times New Roman" w:hAnsi="Times New Roman" w:cs="Times New Roman"/>
+          <w:sz w:val="22"/>
+          <w:szCs w:val="22"/>
+        </w:rPr>
+        <w:t>what would be the best structure for creating a Work Breakdown Structure for this project.</w:t>
       </w:r>
     </w:p>
     <w:p>
@@ -121,6 +137,105 @@
         </w:rPr>
         <w:t xml:space="preserve">It provided a WBS format in text which I then used to format my own Work Breakdown which was made in Microsoft Project. </w:t>
       </w:r>
+    </w:p>
+    <w:p>
+      <w:pPr>
+        <w:rPr>
+          <w:rFonts w:ascii="Times New Roman" w:hAnsi="Times New Roman" w:cs="Times New Roman"/>
+          <w:sz w:val="22"/>
+          <w:szCs w:val="22"/>
+        </w:rPr>
+      </w:pPr>
+    </w:p>
+    <w:p>
+      <w:pPr>
+        <w:rPr>
+          <w:rFonts w:ascii="Times New Roman" w:hAnsi="Times New Roman" w:cs="Times New Roman"/>
+          <w:sz w:val="22"/>
+          <w:szCs w:val="22"/>
+        </w:rPr>
+      </w:pPr>
+      <w:r>
+        <w:rPr>
+          <w:rFonts w:ascii="Times New Roman" w:hAnsi="Times New Roman" w:cs="Times New Roman"/>
+          <w:sz w:val="22"/>
+          <w:szCs w:val="22"/>
+        </w:rPr>
+        <w:t xml:space="preserve">Version 3.0 AI Usage: For version 3.0 of the project management document, I </w:t>
+      </w:r>
+      <w:r>
+        <w:rPr>
+          <w:rFonts w:ascii="Times New Roman" w:hAnsi="Times New Roman" w:cs="Times New Roman"/>
+          <w:sz w:val="22"/>
+          <w:szCs w:val="22"/>
+        </w:rPr>
+        <w:t>used</w:t>
+      </w:r>
+      <w:r>
+        <w:rPr>
+          <w:rFonts w:ascii="Times New Roman" w:hAnsi="Times New Roman" w:cs="Times New Roman"/>
+          <w:sz w:val="22"/>
+          <w:szCs w:val="22"/>
+        </w:rPr>
+        <w:t xml:space="preserve"> AI to figure </w:t>
+      </w:r>
+      <w:r>
+        <w:rPr>
+          <w:rFonts w:ascii="Times New Roman" w:hAnsi="Times New Roman" w:cs="Times New Roman"/>
+          <w:sz w:val="22"/>
+          <w:szCs w:val="22"/>
+        </w:rPr>
+        <w:t xml:space="preserve">out </w:t>
+      </w:r>
+      <w:r>
+        <w:rPr>
+          <w:rFonts w:ascii="Times New Roman" w:hAnsi="Times New Roman" w:cs="Times New Roman"/>
+          <w:sz w:val="22"/>
+          <w:szCs w:val="22"/>
+        </w:rPr>
+        <w:t xml:space="preserve">what would </w:t>
+      </w:r>
+      <w:r>
+        <w:rPr>
+          <w:rFonts w:ascii="Times New Roman" w:hAnsi="Times New Roman" w:cs="Times New Roman"/>
+          <w:sz w:val="22"/>
+          <w:szCs w:val="22"/>
+        </w:rPr>
+        <w:t xml:space="preserve">need to change within the WBS </w:t>
+      </w:r>
+      <w:r>
+        <w:rPr>
+          <w:rFonts w:ascii="Times New Roman" w:hAnsi="Times New Roman" w:cs="Times New Roman"/>
+          <w:sz w:val="22"/>
+          <w:szCs w:val="22"/>
+        </w:rPr>
+        <w:t xml:space="preserve">with the backlog items being created. </w:t>
+      </w:r>
+      <w:r>
+        <w:rPr>
+          <w:rFonts w:ascii="Times New Roman" w:hAnsi="Times New Roman" w:cs="Times New Roman"/>
+          <w:sz w:val="22"/>
+          <w:szCs w:val="22"/>
+        </w:rPr>
+        <w:t xml:space="preserve">I also queried how long each sprint should be and how </w:t>
+      </w:r>
+      <w:r>
+        <w:rPr>
+          <w:rFonts w:ascii="Times New Roman" w:hAnsi="Times New Roman" w:cs="Times New Roman"/>
+          <w:sz w:val="22"/>
+          <w:szCs w:val="22"/>
+        </w:rPr>
+        <w:t xml:space="preserve">many stories or tasks should be completed within the sprint.  </w:t>
+      </w:r>
+    </w:p>
+    <w:p>
+      <w:pPr>
+        <w:rPr>
+          <w:rFonts w:ascii="Times New Roman" w:hAnsi="Times New Roman" w:cs="Times New Roman"/>
+          <w:sz w:val="22"/>
+          <w:szCs w:val="22"/>
+        </w:rPr>
+      </w:pPr>
     </w:p>
     <w:p>
       <w:pPr>
@@ -744,6 +859,7 @@
   <w:style w:type="character" w:default="1" w:styleId="DefaultParagraphFont">
     <w:name w:val="Default Paragraph Font"/>
     <w:uiPriority w:val="1"/>
+    <w:semiHidden/>
     <w:unhideWhenUsed/>
   </w:style>
   <w:style w:type="table" w:default="1" w:styleId="TableNormal">

</xml_diff>

<commit_message>
Version 3.1 of SRS Document (Communication, RR)
</commit_message>
<xml_diff>
--- a/AI Usage Document.docx
+++ b/AI Usage Document.docx
@@ -53,23 +53,13 @@
         </w:rPr>
         <w:t xml:space="preserve">For version 2.0 of the project management document, I </w:t>
       </w:r>
-      <w:proofErr w:type="gramStart"/>
       <w:r>
         <w:rPr>
           <w:rFonts w:ascii="Times New Roman" w:hAnsi="Times New Roman" w:cs="Times New Roman"/>
           <w:sz w:val="22"/>
           <w:szCs w:val="22"/>
         </w:rPr>
-        <w:t>used to</w:t>
-      </w:r>
-      <w:proofErr w:type="gramEnd"/>
-      <w:r>
-        <w:rPr>
-          <w:rFonts w:ascii="Times New Roman" w:hAnsi="Times New Roman" w:cs="Times New Roman"/>
-          <w:sz w:val="22"/>
-          <w:szCs w:val="22"/>
-        </w:rPr>
-        <w:t xml:space="preserve"> AI to figure </w:t>
+        <w:t>used</w:t>
       </w:r>
       <w:r>
         <w:rPr>
@@ -77,15 +67,7 @@
           <w:sz w:val="22"/>
           <w:szCs w:val="22"/>
         </w:rPr>
-        <w:t xml:space="preserve">out </w:t>
-      </w:r>
-      <w:r>
-        <w:rPr>
-          <w:rFonts w:ascii="Times New Roman" w:hAnsi="Times New Roman" w:cs="Times New Roman"/>
-          <w:sz w:val="22"/>
-          <w:szCs w:val="22"/>
-        </w:rPr>
-        <w:t>what would be the best structure for creating a Work Breakdown Structure for this project.</w:t>
+        <w:t xml:space="preserve"> AI to figure out what would be the best structure for creating a Work Breakdown Structure for this project.</w:t>
       </w:r>
     </w:p>
     <w:p>
@@ -102,23 +84,7 @@
           <w:sz w:val="22"/>
           <w:szCs w:val="22"/>
         </w:rPr>
-        <w:t>Prompt: “</w:t>
-      </w:r>
-      <w:r>
-        <w:rPr>
-          <w:rFonts w:ascii="Times New Roman" w:hAnsi="Times New Roman" w:cs="Times New Roman"/>
-          <w:sz w:val="22"/>
-          <w:szCs w:val="22"/>
-        </w:rPr>
-        <w:t>What would be an appropriate WBS format for a Smart Parking Platform.</w:t>
-      </w:r>
-      <w:r>
-        <w:rPr>
-          <w:rFonts w:ascii="Times New Roman" w:hAnsi="Times New Roman" w:cs="Times New Roman"/>
-          <w:sz w:val="22"/>
-          <w:szCs w:val="22"/>
-        </w:rPr>
-        <w:t>”</w:t>
+        <w:t>Prompt: “What would be an appropriate WBS format for a Smart Parking Platform.”</w:t>
       </w:r>
     </w:p>
     <w:p>
@@ -161,71 +127,7 @@
           <w:sz w:val="22"/>
           <w:szCs w:val="22"/>
         </w:rPr>
-        <w:t xml:space="preserve">Version 3.0 AI Usage: For version 3.0 of the project management document, I </w:t>
-      </w:r>
-      <w:r>
-        <w:rPr>
-          <w:rFonts w:ascii="Times New Roman" w:hAnsi="Times New Roman" w:cs="Times New Roman"/>
-          <w:sz w:val="22"/>
-          <w:szCs w:val="22"/>
-        </w:rPr>
-        <w:t>used</w:t>
-      </w:r>
-      <w:r>
-        <w:rPr>
-          <w:rFonts w:ascii="Times New Roman" w:hAnsi="Times New Roman" w:cs="Times New Roman"/>
-          <w:sz w:val="22"/>
-          <w:szCs w:val="22"/>
-        </w:rPr>
-        <w:t xml:space="preserve"> AI to figure </w:t>
-      </w:r>
-      <w:r>
-        <w:rPr>
-          <w:rFonts w:ascii="Times New Roman" w:hAnsi="Times New Roman" w:cs="Times New Roman"/>
-          <w:sz w:val="22"/>
-          <w:szCs w:val="22"/>
-        </w:rPr>
-        <w:t xml:space="preserve">out </w:t>
-      </w:r>
-      <w:r>
-        <w:rPr>
-          <w:rFonts w:ascii="Times New Roman" w:hAnsi="Times New Roman" w:cs="Times New Roman"/>
-          <w:sz w:val="22"/>
-          <w:szCs w:val="22"/>
-        </w:rPr>
-        <w:t xml:space="preserve">what would </w:t>
-      </w:r>
-      <w:r>
-        <w:rPr>
-          <w:rFonts w:ascii="Times New Roman" w:hAnsi="Times New Roman" w:cs="Times New Roman"/>
-          <w:sz w:val="22"/>
-          <w:szCs w:val="22"/>
-        </w:rPr>
-        <w:t xml:space="preserve">need to change within the WBS </w:t>
-      </w:r>
-      <w:r>
-        <w:rPr>
-          <w:rFonts w:ascii="Times New Roman" w:hAnsi="Times New Roman" w:cs="Times New Roman"/>
-          <w:sz w:val="22"/>
-          <w:szCs w:val="22"/>
-        </w:rPr>
-        <w:t xml:space="preserve">with the backlog items being created. </w:t>
-      </w:r>
-      <w:r>
-        <w:rPr>
-          <w:rFonts w:ascii="Times New Roman" w:hAnsi="Times New Roman" w:cs="Times New Roman"/>
-          <w:sz w:val="22"/>
-          <w:szCs w:val="22"/>
-        </w:rPr>
-        <w:t xml:space="preserve">I also queried how long each sprint should be and how </w:t>
-      </w:r>
-      <w:r>
-        <w:rPr>
-          <w:rFonts w:ascii="Times New Roman" w:hAnsi="Times New Roman" w:cs="Times New Roman"/>
-          <w:sz w:val="22"/>
-          <w:szCs w:val="22"/>
-        </w:rPr>
-        <w:t xml:space="preserve">many stories or tasks should be completed within the sprint.  </w:t>
+        <w:t xml:space="preserve">Version 3.0 AI Usage: For version 3.0 of the project management document, I used AI to figure out what would need to change within the WBS with the backlog items being created. I also queried how long each sprint should be and how many stories or tasks should be completed within the sprint.  </w:t>
       </w:r>
     </w:p>
     <w:p>
@@ -236,6 +138,31 @@
           <w:szCs w:val="22"/>
         </w:rPr>
       </w:pPr>
+    </w:p>
+    <w:p>
+      <w:pPr>
+        <w:rPr>
+          <w:rFonts w:ascii="Times New Roman" w:hAnsi="Times New Roman" w:cs="Times New Roman"/>
+          <w:sz w:val="22"/>
+          <w:szCs w:val="22"/>
+        </w:rPr>
+      </w:pPr>
+      <w:r>
+        <w:rPr>
+          <w:rFonts w:ascii="Times New Roman" w:hAnsi="Times New Roman" w:cs="Times New Roman"/>
+          <w:sz w:val="22"/>
+          <w:szCs w:val="22"/>
+        </w:rPr>
+        <w:t>Version 3.1 AI Usage: For version 3.1 of the project management document, I used AI to format the risk register. I did not know how to format the risk register, but it gave me a structured template of what it should be. I also used it to figure out what the most efficient communication plan would be among several dev teams, the project manager, and stakeholders on an enterprise project</w:t>
+      </w:r>
+      <w:r>
+        <w:rPr>
+          <w:rFonts w:ascii="Times New Roman" w:hAnsi="Times New Roman" w:cs="Times New Roman"/>
+          <w:sz w:val="22"/>
+          <w:szCs w:val="22"/>
+        </w:rPr>
+        <w:t xml:space="preserve">. </w:t>
+      </w:r>
     </w:p>
     <w:p>
       <w:pPr>
@@ -656,6 +583,7 @@
   <w:style w:type="paragraph" w:default="1" w:styleId="Normal">
     <w:name w:val="Normal"/>
     <w:qFormat/>
+    <w:rsid w:val="006A2BF4"/>
   </w:style>
   <w:style w:type="paragraph" w:styleId="Heading1">
     <w:name w:val="heading 1"/>

</xml_diff>

<commit_message>
SRS Version 3.2 Resource and Cost Management Plan
SRS Document Update Version 3.2 Resource and Cost Management Plan
</commit_message>
<xml_diff>
--- a/AI Usage Document.docx
+++ b/AI Usage Document.docx
@@ -162,6 +162,80 @@
           <w:szCs w:val="22"/>
         </w:rPr>
         <w:t xml:space="preserve">. </w:t>
+      </w:r>
+    </w:p>
+    <w:p>
+      <w:pPr>
+        <w:rPr>
+          <w:rFonts w:ascii="Times New Roman" w:hAnsi="Times New Roman" w:cs="Times New Roman"/>
+          <w:sz w:val="22"/>
+          <w:szCs w:val="22"/>
+        </w:rPr>
+      </w:pPr>
+    </w:p>
+    <w:p>
+      <w:pPr>
+        <w:rPr>
+          <w:rFonts w:ascii="Times New Roman" w:hAnsi="Times New Roman" w:cs="Times New Roman"/>
+          <w:sz w:val="22"/>
+          <w:szCs w:val="22"/>
+        </w:rPr>
+      </w:pPr>
+      <w:r>
+        <w:rPr>
+          <w:rFonts w:ascii="Times New Roman" w:hAnsi="Times New Roman" w:cs="Times New Roman"/>
+          <w:sz w:val="22"/>
+          <w:szCs w:val="22"/>
+        </w:rPr>
+        <w:t>Version 3.</w:t>
+      </w:r>
+      <w:r>
+        <w:rPr>
+          <w:rFonts w:ascii="Times New Roman" w:hAnsi="Times New Roman" w:cs="Times New Roman"/>
+          <w:sz w:val="22"/>
+          <w:szCs w:val="22"/>
+        </w:rPr>
+        <w:t>2</w:t>
+      </w:r>
+      <w:r>
+        <w:rPr>
+          <w:rFonts w:ascii="Times New Roman" w:hAnsi="Times New Roman" w:cs="Times New Roman"/>
+          <w:sz w:val="22"/>
+          <w:szCs w:val="22"/>
+        </w:rPr>
+        <w:t xml:space="preserve"> AI Usage: For version 3.</w:t>
+      </w:r>
+      <w:r>
+        <w:rPr>
+          <w:rFonts w:ascii="Times New Roman" w:hAnsi="Times New Roman" w:cs="Times New Roman"/>
+          <w:sz w:val="22"/>
+          <w:szCs w:val="22"/>
+        </w:rPr>
+        <w:t>2</w:t>
+      </w:r>
+      <w:r>
+        <w:rPr>
+          <w:rFonts w:ascii="Times New Roman" w:hAnsi="Times New Roman" w:cs="Times New Roman"/>
+          <w:sz w:val="22"/>
+          <w:szCs w:val="22"/>
+        </w:rPr>
+        <w:t xml:space="preserve"> of the project management document, I used AI to </w:t>
+      </w:r>
+      <w:r>
+        <w:rPr>
+          <w:rFonts w:ascii="Times New Roman" w:hAnsi="Times New Roman" w:cs="Times New Roman"/>
+          <w:sz w:val="22"/>
+          <w:szCs w:val="22"/>
+        </w:rPr>
+        <w:t xml:space="preserve">decide which cost estimation method would be best to use, and it determined that bottom-up would be most optimal for this kind of project. I also used it to help me come up with sensible numbers for the Cost Management plan. </w:t>
+      </w:r>
+      <w:r>
+        <w:rPr>
+          <w:rFonts w:ascii="Times New Roman" w:hAnsi="Times New Roman" w:cs="Times New Roman"/>
+          <w:sz w:val="22"/>
+          <w:szCs w:val="22"/>
+        </w:rPr>
+        <w:t xml:space="preserve"> </w:t>
       </w:r>
     </w:p>
     <w:p>
@@ -583,7 +657,7 @@
   <w:style w:type="paragraph" w:default="1" w:styleId="Normal">
     <w:name w:val="Normal"/>
     <w:qFormat/>
-    <w:rsid w:val="006A2BF4"/>
+    <w:rsid w:val="00A91BD0"/>
   </w:style>
   <w:style w:type="paragraph" w:styleId="Heading1">
     <w:name w:val="heading 1"/>

</xml_diff>

<commit_message>
CIS 4374 SRS Version 3.3 (Updating Documentation)
CIS 4374 SRS Version 3.3 (Updating Documentation). Updating multiple sections of the project management plan for the Smart Parking Platform project management.
</commit_message>
<xml_diff>
--- a/AI Usage Document.docx
+++ b/AI Usage Document.docx
@@ -237,6 +237,105 @@
         </w:rPr>
         <w:t xml:space="preserve"> </w:t>
       </w:r>
+    </w:p>
+    <w:p>
+      <w:pPr>
+        <w:rPr>
+          <w:rFonts w:ascii="Times New Roman" w:hAnsi="Times New Roman" w:cs="Times New Roman"/>
+          <w:sz w:val="22"/>
+          <w:szCs w:val="22"/>
+        </w:rPr>
+      </w:pPr>
+    </w:p>
+    <w:p>
+      <w:pPr>
+        <w:rPr>
+          <w:rFonts w:ascii="Times New Roman" w:hAnsi="Times New Roman" w:cs="Times New Roman"/>
+          <w:sz w:val="22"/>
+          <w:szCs w:val="22"/>
+        </w:rPr>
+      </w:pPr>
+      <w:r>
+        <w:rPr>
+          <w:rFonts w:ascii="Times New Roman" w:hAnsi="Times New Roman" w:cs="Times New Roman"/>
+          <w:sz w:val="22"/>
+          <w:szCs w:val="22"/>
+        </w:rPr>
+        <w:t>Version 3.</w:t>
+      </w:r>
+      <w:r>
+        <w:rPr>
+          <w:rFonts w:ascii="Times New Roman" w:hAnsi="Times New Roman" w:cs="Times New Roman"/>
+          <w:sz w:val="22"/>
+          <w:szCs w:val="22"/>
+        </w:rPr>
+        <w:t>3</w:t>
+      </w:r>
+      <w:r>
+        <w:rPr>
+          <w:rFonts w:ascii="Times New Roman" w:hAnsi="Times New Roman" w:cs="Times New Roman"/>
+          <w:sz w:val="22"/>
+          <w:szCs w:val="22"/>
+        </w:rPr>
+        <w:t xml:space="preserve"> AI Usage: For version 3.</w:t>
+      </w:r>
+      <w:r>
+        <w:rPr>
+          <w:rFonts w:ascii="Times New Roman" w:hAnsi="Times New Roman" w:cs="Times New Roman"/>
+          <w:sz w:val="22"/>
+          <w:szCs w:val="22"/>
+        </w:rPr>
+        <w:t>3</w:t>
+      </w:r>
+      <w:r>
+        <w:rPr>
+          <w:rFonts w:ascii="Times New Roman" w:hAnsi="Times New Roman" w:cs="Times New Roman"/>
+          <w:sz w:val="22"/>
+          <w:szCs w:val="22"/>
+        </w:rPr>
+        <w:t xml:space="preserve"> of the project management document, I used AI to </w:t>
+      </w:r>
+      <w:r>
+        <w:rPr>
+          <w:rFonts w:ascii="Times New Roman" w:hAnsi="Times New Roman" w:cs="Times New Roman"/>
+          <w:sz w:val="22"/>
+          <w:szCs w:val="22"/>
+        </w:rPr>
+        <w:t xml:space="preserve">decide which </w:t>
+      </w:r>
+      <w:r>
+        <w:rPr>
+          <w:rFonts w:ascii="Times New Roman" w:hAnsi="Times New Roman" w:cs="Times New Roman"/>
+          <w:sz w:val="22"/>
+          <w:szCs w:val="22"/>
+        </w:rPr>
+        <w:t>parts of the project should be updated</w:t>
+      </w:r>
+      <w:r>
+        <w:rPr>
+          <w:rFonts w:ascii="Times New Roman" w:hAnsi="Times New Roman" w:cs="Times New Roman"/>
+          <w:sz w:val="22"/>
+          <w:szCs w:val="22"/>
+        </w:rPr>
+        <w:t xml:space="preserve">. It determined that it would be best to finalize the project scope and update the Jira backlog and Sprint 1 user stories and tasks. </w:t>
+      </w:r>
+      <w:r>
+        <w:rPr>
+          <w:rFonts w:ascii="Times New Roman" w:hAnsi="Times New Roman" w:cs="Times New Roman"/>
+          <w:sz w:val="22"/>
+          <w:szCs w:val="22"/>
+        </w:rPr>
+        <w:t xml:space="preserve">  </w:t>
+      </w:r>
+    </w:p>
+    <w:p>
+      <w:pPr>
+        <w:rPr>
+          <w:rFonts w:ascii="Times New Roman" w:hAnsi="Times New Roman" w:cs="Times New Roman"/>
+          <w:sz w:val="22"/>
+          <w:szCs w:val="22"/>
+        </w:rPr>
+      </w:pPr>
     </w:p>
     <w:p>
       <w:pPr>

</xml_diff>

<commit_message>
CIS 4374 Weekly Update Week 7
</commit_message>
<xml_diff>
--- a/AI Usage Document.docx
+++ b/AI Usage Document.docx
@@ -301,15 +301,7 @@
           <w:sz w:val="22"/>
           <w:szCs w:val="22"/>
         </w:rPr>
-        <w:t xml:space="preserve">decide which </w:t>
-      </w:r>
-      <w:r>
-        <w:rPr>
-          <w:rFonts w:ascii="Times New Roman" w:hAnsi="Times New Roman" w:cs="Times New Roman"/>
-          <w:sz w:val="22"/>
-          <w:szCs w:val="22"/>
-        </w:rPr>
-        <w:t>parts of the project should be updated</w:t>
+        <w:t>decide which parts of the project should be updated</w:t>
       </w:r>
       <w:r>
         <w:rPr>
@@ -336,6 +328,71 @@
           <w:szCs w:val="22"/>
         </w:rPr>
       </w:pPr>
+    </w:p>
+    <w:p>
+      <w:pPr>
+        <w:rPr>
+          <w:rFonts w:ascii="Times New Roman" w:hAnsi="Times New Roman" w:cs="Times New Roman"/>
+          <w:sz w:val="22"/>
+          <w:szCs w:val="22"/>
+        </w:rPr>
+      </w:pPr>
+      <w:r>
+        <w:rPr>
+          <w:rFonts w:ascii="Times New Roman" w:hAnsi="Times New Roman" w:cs="Times New Roman"/>
+          <w:sz w:val="22"/>
+          <w:szCs w:val="22"/>
+        </w:rPr>
+        <w:t xml:space="preserve">Version </w:t>
+      </w:r>
+      <w:r>
+        <w:rPr>
+          <w:rFonts w:ascii="Times New Roman" w:hAnsi="Times New Roman" w:cs="Times New Roman"/>
+          <w:sz w:val="22"/>
+          <w:szCs w:val="22"/>
+        </w:rPr>
+        <w:t>4.0</w:t>
+      </w:r>
+      <w:r>
+        <w:rPr>
+          <w:rFonts w:ascii="Times New Roman" w:hAnsi="Times New Roman" w:cs="Times New Roman"/>
+          <w:sz w:val="22"/>
+          <w:szCs w:val="22"/>
+        </w:rPr>
+        <w:t xml:space="preserve"> AI Usage: For version </w:t>
+      </w:r>
+      <w:r>
+        <w:rPr>
+          <w:rFonts w:ascii="Times New Roman" w:hAnsi="Times New Roman" w:cs="Times New Roman"/>
+          <w:sz w:val="22"/>
+          <w:szCs w:val="22"/>
+        </w:rPr>
+        <w:t>4.0</w:t>
+      </w:r>
+      <w:r>
+        <w:rPr>
+          <w:rFonts w:ascii="Times New Roman" w:hAnsi="Times New Roman" w:cs="Times New Roman"/>
+          <w:sz w:val="22"/>
+          <w:szCs w:val="22"/>
+        </w:rPr>
+        <w:t xml:space="preserve"> of the project management document, I used AI to </w:t>
+      </w:r>
+      <w:r>
+        <w:rPr>
+          <w:rFonts w:ascii="Times New Roman" w:hAnsi="Times New Roman" w:cs="Times New Roman"/>
+          <w:sz w:val="22"/>
+          <w:szCs w:val="22"/>
+        </w:rPr>
+        <w:t xml:space="preserve">come up with a suitable project and team charter format, and </w:t>
+      </w:r>
+      <w:r>
+        <w:rPr>
+          <w:rFonts w:ascii="Times New Roman" w:hAnsi="Times New Roman" w:cs="Times New Roman"/>
+          <w:sz w:val="22"/>
+          <w:szCs w:val="22"/>
+        </w:rPr>
+        <w:t>what information would be best to highlight on it. It also helped with detailing the Stakeholder chart.</w:t>
+      </w:r>
     </w:p>
     <w:p>
       <w:pPr>
@@ -354,6 +411,10 @@
     </w:sectPr>
   </w:body>
 </w:document>
+</file>
+
+<file path=word/numbering.xml><?xml version="1.0" encoding="utf-8"?>
+<w:numbering xmlns:wpc="http://schemas.microsoft.com/office/word/2010/wordprocessingCanvas" xmlns:cx="http://schemas.microsoft.com/office/drawing/2014/chartex" xmlns:cx1="http://schemas.microsoft.com/office/drawing/2015/9/8/chartex" xmlns:cx2="http://schemas.microsoft.com/office/drawing/2015/10/21/chartex" xmlns:cx3="http://schemas.microsoft.com/office/drawing/2016/5/9/chartex" xmlns:cx4="http://schemas.microsoft.com/office/drawing/2016/5/10/chartex" xmlns:cx5="http://schemas.microsoft.com/office/drawing/2016/5/11/chartex" xmlns:cx6="http://schemas.microsoft.com/office/drawing/2016/5/12/chartex" xmlns:cx7="http://schemas.microsoft.com/office/drawing/2016/5/13/chartex" xmlns:cx8="http://schemas.microsoft.com/office/drawing/2016/5/14/chartex" xmlns:mc="http://schemas.openxmlformats.org/markup-compatibility/2006" xmlns:aink="http://schemas.microsoft.com/office/drawing/2016/ink" xmlns:am3d="http://schemas.microsoft.com/office/drawing/2017/model3d" xmlns:o="urn:schemas-microsoft-com:office:office" xmlns:oel="http://schemas.microsoft.com/office/2019/extlst" xmlns:r="http://schemas.openxmlformats.org/officeDocument/2006/relationships" xmlns:m="http://schemas.openxmlformats.org/officeDocument/2006/math" xmlns:v="urn:schemas-microsoft-com:vml" xmlns:wp14="http://schemas.microsoft.com/office/word/2010/wordprocessingDrawing" xmlns:wp="http://schemas.openxmlformats.org/drawingml/2006/wordprocessingDrawing" xmlns:w10="urn:schemas-microsoft-com:office:word" xmlns:w="http://schemas.openxmlformats.org/wordprocessingml/2006/main" xmlns:w14="http://schemas.microsoft.com/office/word/2010/wordml" xmlns:w15="http://schemas.microsoft.com/office/word/2012/wordml" xmlns:w16cex="http://schemas.microsoft.com/office/word/2018/wordml/cex" xmlns:w16cid="http://schemas.microsoft.com/office/word/2016/wordml/cid" xmlns:w16="http://schemas.microsoft.com/office/word/2018/wordml" xmlns:w16du="http://schemas.microsoft.com/office/word/2023/wordml/word16du" xmlns:w16sdtdh="http://schemas.microsoft.com/office/word/2020/wordml/sdtdatahash" xmlns:w16sdtfl="http://schemas.microsoft.com/office/word/2024/wordml/sdtformatlock" xmlns:w16se="http://schemas.microsoft.com/office/word/2015/wordml/symex" xmlns:wpg="http://schemas.microsoft.com/office/word/2010/wordprocessingGroup" xmlns:wpi="http://schemas.microsoft.com/office/word/2010/wordprocessingInk" xmlns:wne="http://schemas.microsoft.com/office/word/2006/wordml" xmlns:wps="http://schemas.microsoft.com/office/word/2010/wordprocessingShape" mc:Ignorable="w14 w15 w16se w16cid w16 w16cex w16sdtdh w16sdtfl w16du wp14"/>
 </file>
 
 <file path=word/styles.xml><?xml version="1.0" encoding="utf-8"?>

</xml_diff>